<commit_message>
docs: add two-developer Scrum plan to vibe-code report
</commit_message>
<xml_diff>
--- a/docs/reports/ai-vibe-coding-model-comparison-test-report-v2.docx
+++ b/docs/reports/ai-vibe-coding-model-comparison-test-report-v2.docx
@@ -445,7 +445,7 @@
                 <w:color w:val="17324D"/>
                 <w:sz w:val="18"/>
               </w:rPr>
-              <w:t>A human tester follows Section 3, records results in Section 4, then completes Section 5. Use the same conditions and scoring rules for both models.</w:t>
+              <w:t>A human tester follows Section 3, manages the two-developer sprint in Section 4, records results in Section 5, then completes Section 6. Use the same conditions and scoring rules for both models.</w:t>
             </w:r>
           </w:p>
         </w:tc>
@@ -5033,7 +5033,15 @@
         <w:keepNext/>
       </w:pPr>
       <w:r>
-        <w:t>4. Evaluation Results</w:t>
+        <w:t>4. Scrum Management — Two-Developer Work Plan</w:t>
+      </w:r>
+    </w:p>
+    <w:p>
+      <w:pPr>
+        <w:spacing w:after="120" w:line="259" w:lineRule="auto"/>
+      </w:pPr>
+      <w:r>
+        <w:t>Use one five-working-day sprint with a small shared board. Scrum breaks complex work into short, iterative sprints and uses clear roles and regular review to improve delivery.[6] For this two-developer test, keep the process lightweight: one planning session, a 10-minute daily check-in, one cross-review and one final review.</w:t>
       </w:r>
     </w:p>
     <w:p>
@@ -5042,7 +5050,2408 @@
         <w:keepNext/>
       </w:pPr>
       <w:r>
-        <w:t>4.1 Layer 1 — External evidence score</w:t>
+        <w:t>4.1 Roles and ownership</w:t>
+      </w:r>
+    </w:p>
+    <w:tbl>
+      <w:tblPr>
+        <w:tblStyle w:val="TableGrid"/>
+        <w:tblW w:type="auto" w:w="0"/>
+        <w:jc w:val="center"/>
+        <w:tblLayout w:type="fixed"/>
+        <w:tblLook w:firstColumn="1" w:firstRow="1" w:lastColumn="0" w:lastRow="0" w:noHBand="0" w:noVBand="1" w:val="04A0"/>
+      </w:tblPr>
+      <w:tblGrid>
+        <w:gridCol w:w="3400"/>
+        <w:gridCol w:w="3400"/>
+        <w:gridCol w:w="3400"/>
+      </w:tblGrid>
+      <w:tr>
+        <w:tc>
+          <w:tcPr>
+            <w:tcW w:type="dxa" w:w="2268"/>
+            <w:shd w:fill="17324D"/>
+            <w:vAlign w:val="center"/>
+          </w:tcPr>
+          <w:p>
+            <w:pPr>
+              <w:spacing w:after="0"/>
+            </w:pPr>
+            <w:r/>
+            <w:r>
+              <w:rPr>
+                <w:rFonts w:ascii="Aptos" w:hAnsi="Aptos"/>
+                <w:b/>
+                <w:color w:val="FFFFFF"/>
+                <w:sz w:val="18"/>
+              </w:rPr>
+              <w:t>Role</w:t>
+            </w:r>
+          </w:p>
+        </w:tc>
+        <w:tc>
+          <w:tcPr>
+            <w:tcW w:type="dxa" w:w="3969"/>
+            <w:shd w:fill="17324D"/>
+            <w:vAlign w:val="center"/>
+          </w:tcPr>
+          <w:p>
+            <w:pPr>
+              <w:spacing w:after="0"/>
+            </w:pPr>
+            <w:r/>
+            <w:r>
+              <w:rPr>
+                <w:rFonts w:ascii="Aptos" w:hAnsi="Aptos"/>
+                <w:b/>
+                <w:color w:val="FFFFFF"/>
+                <w:sz w:val="18"/>
+              </w:rPr>
+              <w:t>Primary responsibility</w:t>
+            </w:r>
+          </w:p>
+        </w:tc>
+        <w:tc>
+          <w:tcPr>
+            <w:tcW w:type="dxa" w:w="3402"/>
+            <w:shd w:fill="17324D"/>
+            <w:vAlign w:val="center"/>
+          </w:tcPr>
+          <w:p>
+            <w:pPr>
+              <w:spacing w:after="0"/>
+            </w:pPr>
+            <w:r/>
+            <w:r>
+              <w:rPr>
+                <w:rFonts w:ascii="Aptos" w:hAnsi="Aptos"/>
+                <w:b/>
+                <w:color w:val="FFFFFF"/>
+                <w:sz w:val="18"/>
+              </w:rPr>
+              <w:t>Secondary responsibility</w:t>
+            </w:r>
+          </w:p>
+        </w:tc>
+      </w:tr>
+      <w:tr>
+        <w:tc>
+          <w:tcPr>
+            <w:tcW w:type="dxa" w:w="2268"/>
+            <w:vAlign w:val="center"/>
+          </w:tcPr>
+          <w:p>
+            <w:pPr>
+              <w:spacing w:after="0"/>
+            </w:pPr>
+            <w:r/>
+            <w:r>
+              <w:rPr>
+                <w:rFonts w:ascii="Aptos" w:hAnsi="Aptos"/>
+                <w:b/>
+                <w:color w:val="17324D"/>
+                <w:sz w:val="17"/>
+              </w:rPr>
+              <w:t>Test owner / Product Owner</w:t>
+            </w:r>
+          </w:p>
+        </w:tc>
+        <w:tc>
+          <w:tcPr>
+            <w:tcW w:type="dxa" w:w="3969"/>
+            <w:vAlign w:val="center"/>
+          </w:tcPr>
+          <w:p>
+            <w:pPr>
+              <w:spacing w:after="0"/>
+            </w:pPr>
+            <w:r/>
+            <w:r>
+              <w:rPr>
+                <w:rFonts w:ascii="Aptos" w:hAnsi="Aptos"/>
+                <w:b w:val="0"/>
+                <w:sz w:val="17"/>
+              </w:rPr>
+              <w:t>Freeze both app requirements, model IDs, scoring weights and acceptance criteria.</w:t>
+            </w:r>
+          </w:p>
+        </w:tc>
+        <w:tc>
+          <w:tcPr>
+            <w:tcW w:type="dxa" w:w="3402"/>
+            <w:vAlign w:val="center"/>
+          </w:tcPr>
+          <w:p>
+            <w:pPr>
+              <w:spacing w:after="0"/>
+            </w:pPr>
+            <w:r/>
+            <w:r>
+              <w:rPr>
+                <w:rFonts w:ascii="Aptos" w:hAnsi="Aptos"/>
+                <w:b w:val="0"/>
+                <w:sz w:val="17"/>
+              </w:rPr>
+              <w:t>Resolve scope questions and approve the final recommendation.</w:t>
+            </w:r>
+          </w:p>
+        </w:tc>
+      </w:tr>
+      <w:tr>
+        <w:tc>
+          <w:tcPr>
+            <w:tcW w:type="dxa" w:w="2268"/>
+            <w:shd w:fill="F2F6F9"/>
+            <w:vAlign w:val="center"/>
+          </w:tcPr>
+          <w:p>
+            <w:pPr>
+              <w:spacing w:after="0"/>
+            </w:pPr>
+            <w:r/>
+            <w:r>
+              <w:rPr>
+                <w:rFonts w:ascii="Aptos" w:hAnsi="Aptos"/>
+                <w:b/>
+                <w:color w:val="17324D"/>
+                <w:sz w:val="17"/>
+              </w:rPr>
+              <w:t>Developer 1 — To-Do List owner</w:t>
+            </w:r>
+          </w:p>
+        </w:tc>
+        <w:tc>
+          <w:tcPr>
+            <w:tcW w:type="dxa" w:w="3969"/>
+            <w:shd w:fill="F2F6F9"/>
+            <w:vAlign w:val="center"/>
+          </w:tcPr>
+          <w:p>
+            <w:pPr>
+              <w:spacing w:after="0"/>
+            </w:pPr>
+            <w:r/>
+            <w:r>
+              <w:rPr>
+                <w:rFonts w:ascii="Aptos" w:hAnsi="Aptos"/>
+                <w:b w:val="0"/>
+                <w:sz w:val="17"/>
+              </w:rPr>
+              <w:t>Run both models on the To-Do List and record objective results.</w:t>
+            </w:r>
+          </w:p>
+        </w:tc>
+        <w:tc>
+          <w:tcPr>
+            <w:tcW w:type="dxa" w:w="3402"/>
+            <w:shd w:fill="F2F6F9"/>
+            <w:vAlign w:val="center"/>
+          </w:tcPr>
+          <w:p>
+            <w:pPr>
+              <w:spacing w:after="0"/>
+            </w:pPr>
+            <w:r/>
+            <w:r>
+              <w:rPr>
+                <w:rFonts w:ascii="Aptos" w:hAnsi="Aptos"/>
+                <w:b w:val="0"/>
+                <w:sz w:val="17"/>
+              </w:rPr>
+              <w:t>Cross-review the shooter output and human score.</w:t>
+            </w:r>
+          </w:p>
+        </w:tc>
+      </w:tr>
+      <w:tr>
+        <w:tc>
+          <w:tcPr>
+            <w:tcW w:type="dxa" w:w="2268"/>
+            <w:vAlign w:val="center"/>
+          </w:tcPr>
+          <w:p>
+            <w:pPr>
+              <w:spacing w:after="0"/>
+            </w:pPr>
+            <w:r/>
+            <w:r>
+              <w:rPr>
+                <w:rFonts w:ascii="Aptos" w:hAnsi="Aptos"/>
+                <w:b/>
+                <w:color w:val="17324D"/>
+                <w:sz w:val="17"/>
+              </w:rPr>
+              <w:t>Developer 2 — Shooter owner</w:t>
+            </w:r>
+          </w:p>
+        </w:tc>
+        <w:tc>
+          <w:tcPr>
+            <w:tcW w:type="dxa" w:w="3969"/>
+            <w:vAlign w:val="center"/>
+          </w:tcPr>
+          <w:p>
+            <w:pPr>
+              <w:spacing w:after="0"/>
+            </w:pPr>
+            <w:r/>
+            <w:r>
+              <w:rPr>
+                <w:rFonts w:ascii="Aptos" w:hAnsi="Aptos"/>
+                <w:b w:val="0"/>
+                <w:sz w:val="17"/>
+              </w:rPr>
+              <w:t>Run both models on the 1942-style shooter and record objective results.</w:t>
+            </w:r>
+          </w:p>
+        </w:tc>
+        <w:tc>
+          <w:tcPr>
+            <w:tcW w:type="dxa" w:w="3402"/>
+            <w:vAlign w:val="center"/>
+          </w:tcPr>
+          <w:p>
+            <w:pPr>
+              <w:spacing w:after="0"/>
+            </w:pPr>
+            <w:r/>
+            <w:r>
+              <w:rPr>
+                <w:rFonts w:ascii="Aptos" w:hAnsi="Aptos"/>
+                <w:b w:val="0"/>
+                <w:sz w:val="17"/>
+              </w:rPr>
+              <w:t>Cross-review the To-Do List output and human score.</w:t>
+            </w:r>
+          </w:p>
+        </w:tc>
+      </w:tr>
+      <w:tr>
+        <w:tc>
+          <w:tcPr>
+            <w:tcW w:type="dxa" w:w="2268"/>
+            <w:shd w:fill="F2F6F9"/>
+            <w:vAlign w:val="center"/>
+          </w:tcPr>
+          <w:p>
+            <w:pPr>
+              <w:spacing w:after="0"/>
+            </w:pPr>
+            <w:r/>
+            <w:r>
+              <w:rPr>
+                <w:rFonts w:ascii="Aptos" w:hAnsi="Aptos"/>
+                <w:b/>
+                <w:color w:val="17324D"/>
+                <w:sz w:val="17"/>
+              </w:rPr>
+              <w:t>Scrum facilitator</w:t>
+            </w:r>
+          </w:p>
+        </w:tc>
+        <w:tc>
+          <w:tcPr>
+            <w:tcW w:type="dxa" w:w="3969"/>
+            <w:shd w:fill="F2F6F9"/>
+            <w:vAlign w:val="center"/>
+          </w:tcPr>
+          <w:p>
+            <w:pPr>
+              <w:spacing w:after="0"/>
+            </w:pPr>
+            <w:r/>
+            <w:r>
+              <w:rPr>
+                <w:rFonts w:ascii="Aptos" w:hAnsi="Aptos"/>
+                <w:b w:val="0"/>
+                <w:sz w:val="17"/>
+              </w:rPr>
+              <w:t>Developer 1 on Days 1–2; Developer 2 on Days 3–5.</w:t>
+            </w:r>
+          </w:p>
+        </w:tc>
+        <w:tc>
+          <w:tcPr>
+            <w:tcW w:type="dxa" w:w="3402"/>
+            <w:shd w:fill="F2F6F9"/>
+            <w:vAlign w:val="center"/>
+          </w:tcPr>
+          <w:p>
+            <w:pPr>
+              <w:spacing w:after="0"/>
+            </w:pPr>
+            <w:r/>
+            <w:r>
+              <w:rPr>
+                <w:rFonts w:ascii="Aptos" w:hAnsi="Aptos"/>
+                <w:b w:val="0"/>
+                <w:sz w:val="17"/>
+              </w:rPr>
+              <w:t>Keep the board current and remove blockers; this is not a separate full-time role.</w:t>
+            </w:r>
+          </w:p>
+        </w:tc>
+      </w:tr>
+    </w:tbl>
+    <w:p>
+      <w:pPr>
+        <w:spacing w:after="20"/>
+      </w:pPr>
+    </w:p>
+    <w:tbl>
+      <w:tblPr>
+        <w:tblW w:type="auto" w:w="0"/>
+        <w:jc w:val="center"/>
+        <w:tblLook w:firstColumn="1" w:firstRow="1" w:lastColumn="0" w:lastRow="0" w:noHBand="0" w:noVBand="1" w:val="04A0"/>
+      </w:tblPr>
+      <w:tblGrid>
+        <w:gridCol w:w="10200"/>
+      </w:tblGrid>
+      <w:tr>
+        <w:tc>
+          <w:tcPr>
+            <w:tcW w:type="dxa" w:w="10200"/>
+            <w:shd w:fill="FCE7D5"/>
+          </w:tcPr>
+          <w:p>
+            <w:pPr>
+              <w:spacing w:after="40"/>
+            </w:pPr>
+            <w:r/>
+            <w:r>
+              <w:rPr>
+                <w:b/>
+                <w:color w:val="17324D"/>
+                <w:sz w:val="22"/>
+              </w:rPr>
+              <w:t>Fairness rule</w:t>
+              <w:br/>
+            </w:r>
+            <w:r>
+              <w:rPr>
+                <w:color w:val="17324D"/>
+                <w:sz w:val="18"/>
+              </w:rPr>
+              <w:t>Each developer tests both Model A and Model B for the application they own. Do not assign one model to each developer; that would mix model performance with developer differences.</w:t>
+            </w:r>
+          </w:p>
+        </w:tc>
+      </w:tr>
+    </w:tbl>
+    <w:p>
+      <w:pPr>
+        <w:spacing w:after="20"/>
+      </w:pPr>
+    </w:p>
+    <w:p>
+      <w:pPr>
+        <w:pStyle w:val="Heading2"/>
+        <w:keepNext/>
+      </w:pPr>
+      <w:r>
+        <w:t>4.2 Sprint board</w:t>
+      </w:r>
+    </w:p>
+    <w:tbl>
+      <w:tblPr>
+        <w:tblStyle w:val="TableGrid"/>
+        <w:tblW w:type="auto" w:w="0"/>
+        <w:jc w:val="center"/>
+        <w:tblLayout w:type="fixed"/>
+        <w:tblLook w:firstColumn="1" w:firstRow="1" w:lastColumn="0" w:lastRow="0" w:noHBand="0" w:noVBand="1" w:val="04A0"/>
+      </w:tblPr>
+      <w:tblGrid>
+        <w:gridCol w:w="3400"/>
+        <w:gridCol w:w="3400"/>
+        <w:gridCol w:w="3400"/>
+      </w:tblGrid>
+      <w:tr>
+        <w:tc>
+          <w:tcPr>
+            <w:tcW w:type="dxa" w:w="1814"/>
+            <w:shd w:fill="17324D"/>
+            <w:vAlign w:val="center"/>
+          </w:tcPr>
+          <w:p>
+            <w:pPr>
+              <w:spacing w:after="0"/>
+            </w:pPr>
+            <w:r/>
+            <w:r>
+              <w:rPr>
+                <w:rFonts w:ascii="Aptos" w:hAnsi="Aptos"/>
+                <w:b/>
+                <w:color w:val="FFFFFF"/>
+                <w:sz w:val="18"/>
+              </w:rPr>
+              <w:t>Board state</w:t>
+            </w:r>
+          </w:p>
+        </w:tc>
+        <w:tc>
+          <w:tcPr>
+            <w:tcW w:type="dxa" w:w="3969"/>
+            <w:shd w:fill="17324D"/>
+            <w:vAlign w:val="center"/>
+          </w:tcPr>
+          <w:p>
+            <w:pPr>
+              <w:spacing w:after="0"/>
+            </w:pPr>
+            <w:r/>
+            <w:r>
+              <w:rPr>
+                <w:rFonts w:ascii="Aptos" w:hAnsi="Aptos"/>
+                <w:b/>
+                <w:color w:val="FFFFFF"/>
+                <w:sz w:val="18"/>
+              </w:rPr>
+              <w:t>Entry rule</w:t>
+            </w:r>
+          </w:p>
+        </w:tc>
+        <w:tc>
+          <w:tcPr>
+            <w:tcW w:type="dxa" w:w="3855"/>
+            <w:shd w:fill="17324D"/>
+            <w:vAlign w:val="center"/>
+          </w:tcPr>
+          <w:p>
+            <w:pPr>
+              <w:spacing w:after="0"/>
+            </w:pPr>
+            <w:r/>
+            <w:r>
+              <w:rPr>
+                <w:rFonts w:ascii="Aptos" w:hAnsi="Aptos"/>
+                <w:b/>
+                <w:color w:val="FFFFFF"/>
+                <w:sz w:val="18"/>
+              </w:rPr>
+              <w:t>Exit rule</w:t>
+            </w:r>
+          </w:p>
+        </w:tc>
+      </w:tr>
+      <w:tr>
+        <w:tc>
+          <w:tcPr>
+            <w:tcW w:type="dxa" w:w="1814"/>
+            <w:vAlign w:val="center"/>
+          </w:tcPr>
+          <w:p>
+            <w:pPr>
+              <w:spacing w:after="0"/>
+            </w:pPr>
+            <w:r/>
+            <w:r>
+              <w:rPr>
+                <w:rFonts w:ascii="Aptos" w:hAnsi="Aptos"/>
+                <w:b/>
+                <w:color w:val="17324D"/>
+                <w:sz w:val="17"/>
+              </w:rPr>
+              <w:t>Backlog</w:t>
+            </w:r>
+          </w:p>
+        </w:tc>
+        <w:tc>
+          <w:tcPr>
+            <w:tcW w:type="dxa" w:w="3969"/>
+            <w:vAlign w:val="center"/>
+          </w:tcPr>
+          <w:p>
+            <w:pPr>
+              <w:spacing w:after="0"/>
+            </w:pPr>
+            <w:r/>
+            <w:r>
+              <w:rPr>
+                <w:rFonts w:ascii="Aptos" w:hAnsi="Aptos"/>
+                <w:b w:val="0"/>
+                <w:sz w:val="17"/>
+              </w:rPr>
+              <w:t>Task is identified but not yet ready.</w:t>
+            </w:r>
+          </w:p>
+        </w:tc>
+        <w:tc>
+          <w:tcPr>
+            <w:tcW w:type="dxa" w:w="3855"/>
+            <w:vAlign w:val="center"/>
+          </w:tcPr>
+          <w:p>
+            <w:pPr>
+              <w:spacing w:after="0"/>
+            </w:pPr>
+            <w:r/>
+            <w:r>
+              <w:rPr>
+                <w:rFonts w:ascii="Aptos" w:hAnsi="Aptos"/>
+                <w:b w:val="0"/>
+                <w:sz w:val="17"/>
+              </w:rPr>
+              <w:t>Requirements and acceptance criteria are clear.</w:t>
+            </w:r>
+          </w:p>
+        </w:tc>
+      </w:tr>
+      <w:tr>
+        <w:tc>
+          <w:tcPr>
+            <w:tcW w:type="dxa" w:w="1814"/>
+            <w:shd w:fill="F2F6F9"/>
+            <w:vAlign w:val="center"/>
+          </w:tcPr>
+          <w:p>
+            <w:pPr>
+              <w:spacing w:after="0"/>
+            </w:pPr>
+            <w:r/>
+            <w:r>
+              <w:rPr>
+                <w:rFonts w:ascii="Aptos" w:hAnsi="Aptos"/>
+                <w:b/>
+                <w:color w:val="17324D"/>
+                <w:sz w:val="17"/>
+              </w:rPr>
+              <w:t>Ready</w:t>
+            </w:r>
+          </w:p>
+        </w:tc>
+        <w:tc>
+          <w:tcPr>
+            <w:tcW w:type="dxa" w:w="3969"/>
+            <w:shd w:fill="F2F6F9"/>
+            <w:vAlign w:val="center"/>
+          </w:tcPr>
+          <w:p>
+            <w:pPr>
+              <w:spacing w:after="0"/>
+            </w:pPr>
+            <w:r/>
+            <w:r>
+              <w:rPr>
+                <w:rFonts w:ascii="Aptos" w:hAnsi="Aptos"/>
+                <w:b w:val="0"/>
+                <w:sz w:val="17"/>
+              </w:rPr>
+              <w:t>Dependencies are available and the task can start.</w:t>
+            </w:r>
+          </w:p>
+        </w:tc>
+        <w:tc>
+          <w:tcPr>
+            <w:tcW w:type="dxa" w:w="3855"/>
+            <w:shd w:fill="F2F6F9"/>
+            <w:vAlign w:val="center"/>
+          </w:tcPr>
+          <w:p>
+            <w:pPr>
+              <w:spacing w:after="0"/>
+            </w:pPr>
+            <w:r/>
+            <w:r>
+              <w:rPr>
+                <w:rFonts w:ascii="Aptos" w:hAnsi="Aptos"/>
+                <w:b w:val="0"/>
+                <w:sz w:val="17"/>
+              </w:rPr>
+              <w:t>A developer pulls it within the WIP limit.</w:t>
+            </w:r>
+          </w:p>
+        </w:tc>
+      </w:tr>
+      <w:tr>
+        <w:tc>
+          <w:tcPr>
+            <w:tcW w:type="dxa" w:w="1814"/>
+            <w:vAlign w:val="center"/>
+          </w:tcPr>
+          <w:p>
+            <w:pPr>
+              <w:spacing w:after="0"/>
+            </w:pPr>
+            <w:r/>
+            <w:r>
+              <w:rPr>
+                <w:rFonts w:ascii="Aptos" w:hAnsi="Aptos"/>
+                <w:b/>
+                <w:color w:val="17324D"/>
+                <w:sz w:val="17"/>
+              </w:rPr>
+              <w:t>In Progress</w:t>
+            </w:r>
+          </w:p>
+        </w:tc>
+        <w:tc>
+          <w:tcPr>
+            <w:tcW w:type="dxa" w:w="3969"/>
+            <w:vAlign w:val="center"/>
+          </w:tcPr>
+          <w:p>
+            <w:pPr>
+              <w:spacing w:after="0"/>
+            </w:pPr>
+            <w:r/>
+            <w:r>
+              <w:rPr>
+                <w:rFonts w:ascii="Aptos" w:hAnsi="Aptos"/>
+                <w:b w:val="0"/>
+                <w:sz w:val="17"/>
+              </w:rPr>
+              <w:t>Work has started; one active task maximum per developer.</w:t>
+            </w:r>
+          </w:p>
+        </w:tc>
+        <w:tc>
+          <w:tcPr>
+            <w:tcW w:type="dxa" w:w="3855"/>
+            <w:vAlign w:val="center"/>
+          </w:tcPr>
+          <w:p>
+            <w:pPr>
+              <w:spacing w:after="0"/>
+            </w:pPr>
+            <w:r/>
+            <w:r>
+              <w:rPr>
+                <w:rFonts w:ascii="Aptos" w:hAnsi="Aptos"/>
+                <w:b w:val="0"/>
+                <w:sz w:val="17"/>
+              </w:rPr>
+              <w:t>Output is runnable and self-checked.</w:t>
+            </w:r>
+          </w:p>
+        </w:tc>
+      </w:tr>
+      <w:tr>
+        <w:tc>
+          <w:tcPr>
+            <w:tcW w:type="dxa" w:w="1814"/>
+            <w:shd w:fill="F2F6F9"/>
+            <w:vAlign w:val="center"/>
+          </w:tcPr>
+          <w:p>
+            <w:pPr>
+              <w:spacing w:after="0"/>
+            </w:pPr>
+            <w:r/>
+            <w:r>
+              <w:rPr>
+                <w:rFonts w:ascii="Aptos" w:hAnsi="Aptos"/>
+                <w:b/>
+                <w:color w:val="17324D"/>
+                <w:sz w:val="17"/>
+              </w:rPr>
+              <w:t>Review</w:t>
+            </w:r>
+          </w:p>
+        </w:tc>
+        <w:tc>
+          <w:tcPr>
+            <w:tcW w:type="dxa" w:w="3969"/>
+            <w:shd w:fill="F2F6F9"/>
+            <w:vAlign w:val="center"/>
+          </w:tcPr>
+          <w:p>
+            <w:pPr>
+              <w:spacing w:after="0"/>
+            </w:pPr>
+            <w:r/>
+            <w:r>
+              <w:rPr>
+                <w:rFonts w:ascii="Aptos" w:hAnsi="Aptos"/>
+                <w:b w:val="0"/>
+                <w:sz w:val="17"/>
+              </w:rPr>
+              <w:t>Owner has supplied the output and recorded results.</w:t>
+            </w:r>
+          </w:p>
+        </w:tc>
+        <w:tc>
+          <w:tcPr>
+            <w:tcW w:type="dxa" w:w="3855"/>
+            <w:shd w:fill="F2F6F9"/>
+            <w:vAlign w:val="center"/>
+          </w:tcPr>
+          <w:p>
+            <w:pPr>
+              <w:spacing w:after="0"/>
+            </w:pPr>
+            <w:r/>
+            <w:r>
+              <w:rPr>
+                <w:rFonts w:ascii="Aptos" w:hAnsi="Aptos"/>
+                <w:b w:val="0"/>
+                <w:sz w:val="17"/>
+              </w:rPr>
+              <w:t>Other developer completes cross-review.</w:t>
+            </w:r>
+          </w:p>
+        </w:tc>
+      </w:tr>
+      <w:tr>
+        <w:tc>
+          <w:tcPr>
+            <w:tcW w:type="dxa" w:w="1814"/>
+            <w:vAlign w:val="center"/>
+          </w:tcPr>
+          <w:p>
+            <w:pPr>
+              <w:spacing w:after="0"/>
+            </w:pPr>
+            <w:r/>
+            <w:r>
+              <w:rPr>
+                <w:rFonts w:ascii="Aptos" w:hAnsi="Aptos"/>
+                <w:b/>
+                <w:color w:val="17324D"/>
+                <w:sz w:val="17"/>
+              </w:rPr>
+              <w:t>Done</w:t>
+            </w:r>
+          </w:p>
+        </w:tc>
+        <w:tc>
+          <w:tcPr>
+            <w:tcW w:type="dxa" w:w="3969"/>
+            <w:vAlign w:val="center"/>
+          </w:tcPr>
+          <w:p>
+            <w:pPr>
+              <w:spacing w:after="0"/>
+            </w:pPr>
+            <w:r/>
+            <w:r>
+              <w:rPr>
+                <w:rFonts w:ascii="Aptos" w:hAnsi="Aptos"/>
+                <w:b w:val="0"/>
+                <w:sz w:val="17"/>
+              </w:rPr>
+              <w:t>Acceptance criteria pass or failure is clearly recorded.</w:t>
+            </w:r>
+          </w:p>
+        </w:tc>
+        <w:tc>
+          <w:tcPr>
+            <w:tcW w:type="dxa" w:w="3855"/>
+            <w:vAlign w:val="center"/>
+          </w:tcPr>
+          <w:p>
+            <w:pPr>
+              <w:spacing w:after="0"/>
+            </w:pPr>
+            <w:r/>
+            <w:r>
+              <w:rPr>
+                <w:rFonts w:ascii="Aptos" w:hAnsi="Aptos"/>
+                <w:b w:val="0"/>
+                <w:sz w:val="17"/>
+              </w:rPr>
+              <w:t>Result is included in the final scoring table.</w:t>
+            </w:r>
+          </w:p>
+        </w:tc>
+      </w:tr>
+    </w:tbl>
+    <w:p>
+      <w:pPr>
+        <w:spacing w:after="20"/>
+      </w:pPr>
+    </w:p>
+    <w:p>
+      <w:pPr>
+        <w:pStyle w:val="Heading2"/>
+        <w:keepNext/>
+      </w:pPr>
+      <w:r>
+        <w:t>4.3 Tasks for Developer 1 — To-Do List owner</w:t>
+      </w:r>
+    </w:p>
+    <w:tbl>
+      <w:tblPr>
+        <w:tblStyle w:val="TableGrid"/>
+        <w:tblW w:type="auto" w:w="0"/>
+        <w:jc w:val="center"/>
+        <w:tblLayout w:type="fixed"/>
+        <w:tblLook w:firstColumn="1" w:firstRow="1" w:lastColumn="0" w:lastRow="0" w:noHBand="0" w:noVBand="1" w:val="04A0"/>
+      </w:tblPr>
+      <w:tblGrid>
+        <w:gridCol w:w="3400"/>
+        <w:gridCol w:w="3400"/>
+        <w:gridCol w:w="3400"/>
+      </w:tblGrid>
+      <w:tr>
+        <w:tc>
+          <w:tcPr>
+            <w:tcW w:type="dxa" w:w="1247"/>
+            <w:shd w:fill="17324D"/>
+            <w:vAlign w:val="center"/>
+          </w:tcPr>
+          <w:p>
+            <w:pPr>
+              <w:spacing w:after="0"/>
+            </w:pPr>
+            <w:r/>
+            <w:r>
+              <w:rPr>
+                <w:rFonts w:ascii="Aptos" w:hAnsi="Aptos"/>
+                <w:b/>
+                <w:color w:val="FFFFFF"/>
+                <w:sz w:val="18"/>
+              </w:rPr>
+              <w:t>Task ID</w:t>
+            </w:r>
+          </w:p>
+        </w:tc>
+        <w:tc>
+          <w:tcPr>
+            <w:tcW w:type="dxa" w:w="3969"/>
+            <w:shd w:fill="17324D"/>
+            <w:vAlign w:val="center"/>
+          </w:tcPr>
+          <w:p>
+            <w:pPr>
+              <w:spacing w:after="0"/>
+            </w:pPr>
+            <w:r/>
+            <w:r>
+              <w:rPr>
+                <w:rFonts w:ascii="Aptos" w:hAnsi="Aptos"/>
+                <w:b/>
+                <w:color w:val="FFFFFF"/>
+                <w:sz w:val="18"/>
+              </w:rPr>
+              <w:t>Task</w:t>
+            </w:r>
+          </w:p>
+        </w:tc>
+        <w:tc>
+          <w:tcPr>
+            <w:tcW w:type="dxa" w:w="4422"/>
+            <w:shd w:fill="17324D"/>
+            <w:vAlign w:val="center"/>
+          </w:tcPr>
+          <w:p>
+            <w:pPr>
+              <w:spacing w:after="0"/>
+            </w:pPr>
+            <w:r/>
+            <w:r>
+              <w:rPr>
+                <w:rFonts w:ascii="Aptos" w:hAnsi="Aptos"/>
+                <w:b/>
+                <w:color w:val="FFFFFF"/>
+                <w:sz w:val="18"/>
+              </w:rPr>
+              <w:t>Definition of done</w:t>
+            </w:r>
+          </w:p>
+        </w:tc>
+      </w:tr>
+      <w:tr>
+        <w:tc>
+          <w:tcPr>
+            <w:tcW w:type="dxa" w:w="1247"/>
+            <w:vAlign w:val="center"/>
+          </w:tcPr>
+          <w:p>
+            <w:pPr>
+              <w:spacing w:after="0"/>
+            </w:pPr>
+            <w:r/>
+            <w:r>
+              <w:rPr>
+                <w:rFonts w:ascii="Aptos" w:hAnsi="Aptos"/>
+                <w:b/>
+                <w:color w:val="17324D"/>
+                <w:sz w:val="17"/>
+              </w:rPr>
+              <w:t>D1-01</w:t>
+            </w:r>
+          </w:p>
+        </w:tc>
+        <w:tc>
+          <w:tcPr>
+            <w:tcW w:type="dxa" w:w="3969"/>
+            <w:vAlign w:val="center"/>
+          </w:tcPr>
+          <w:p>
+            <w:pPr>
+              <w:spacing w:after="0"/>
+            </w:pPr>
+            <w:r/>
+            <w:r>
+              <w:rPr>
+                <w:rFonts w:ascii="Aptos" w:hAnsi="Aptos"/>
+                <w:b w:val="0"/>
+                <w:sz w:val="17"/>
+              </w:rPr>
+              <w:t>Prepare identical To-Do List starting repositories and verify the frozen prompt.</w:t>
+            </w:r>
+          </w:p>
+        </w:tc>
+        <w:tc>
+          <w:tcPr>
+            <w:tcW w:type="dxa" w:w="4422"/>
+            <w:vAlign w:val="center"/>
+          </w:tcPr>
+          <w:p>
+            <w:pPr>
+              <w:spacing w:after="0"/>
+            </w:pPr>
+            <w:r/>
+            <w:r>
+              <w:rPr>
+                <w:rFonts w:ascii="Aptos" w:hAnsi="Aptos"/>
+                <w:b w:val="0"/>
+                <w:sz w:val="17"/>
+              </w:rPr>
+              <w:t>Both copies start from the same commit and environment.</w:t>
+            </w:r>
+          </w:p>
+        </w:tc>
+      </w:tr>
+      <w:tr>
+        <w:tc>
+          <w:tcPr>
+            <w:tcW w:type="dxa" w:w="1247"/>
+            <w:shd w:fill="F2F6F9"/>
+            <w:vAlign w:val="center"/>
+          </w:tcPr>
+          <w:p>
+            <w:pPr>
+              <w:spacing w:after="0"/>
+            </w:pPr>
+            <w:r/>
+            <w:r>
+              <w:rPr>
+                <w:rFonts w:ascii="Aptos" w:hAnsi="Aptos"/>
+                <w:b/>
+                <w:color w:val="17324D"/>
+                <w:sz w:val="17"/>
+              </w:rPr>
+              <w:t>D1-02</w:t>
+            </w:r>
+          </w:p>
+        </w:tc>
+        <w:tc>
+          <w:tcPr>
+            <w:tcW w:type="dxa" w:w="3969"/>
+            <w:shd w:fill="F2F6F9"/>
+            <w:vAlign w:val="center"/>
+          </w:tcPr>
+          <w:p>
+            <w:pPr>
+              <w:spacing w:after="0"/>
+            </w:pPr>
+            <w:r/>
+            <w:r>
+              <w:rPr>
+                <w:rFonts w:ascii="Aptos" w:hAnsi="Aptos"/>
+                <w:b w:val="0"/>
+                <w:sz w:val="17"/>
+              </w:rPr>
+              <w:t>Run Model A twice on the To-Do List.</w:t>
+            </w:r>
+          </w:p>
+        </w:tc>
+        <w:tc>
+          <w:tcPr>
+            <w:tcW w:type="dxa" w:w="4422"/>
+            <w:shd w:fill="F2F6F9"/>
+            <w:vAlign w:val="center"/>
+          </w:tcPr>
+          <w:p>
+            <w:pPr>
+              <w:spacing w:after="0"/>
+            </w:pPr>
+            <w:r/>
+            <w:r>
+              <w:rPr>
+                <w:rFonts w:ascii="Aptos" w:hAnsi="Aptos"/>
+                <w:b w:val="0"/>
+                <w:sz w:val="17"/>
+              </w:rPr>
+              <w:t>Both outputs, times, costs and correction counts are recorded.</w:t>
+            </w:r>
+          </w:p>
+        </w:tc>
+      </w:tr>
+      <w:tr>
+        <w:tc>
+          <w:tcPr>
+            <w:tcW w:type="dxa" w:w="1247"/>
+            <w:vAlign w:val="center"/>
+          </w:tcPr>
+          <w:p>
+            <w:pPr>
+              <w:spacing w:after="0"/>
+            </w:pPr>
+            <w:r/>
+            <w:r>
+              <w:rPr>
+                <w:rFonts w:ascii="Aptos" w:hAnsi="Aptos"/>
+                <w:b/>
+                <w:color w:val="17324D"/>
+                <w:sz w:val="17"/>
+              </w:rPr>
+              <w:t>D1-03</w:t>
+            </w:r>
+          </w:p>
+        </w:tc>
+        <w:tc>
+          <w:tcPr>
+            <w:tcW w:type="dxa" w:w="3969"/>
+            <w:vAlign w:val="center"/>
+          </w:tcPr>
+          <w:p>
+            <w:pPr>
+              <w:spacing w:after="0"/>
+            </w:pPr>
+            <w:r/>
+            <w:r>
+              <w:rPr>
+                <w:rFonts w:ascii="Aptos" w:hAnsi="Aptos"/>
+                <w:b w:val="0"/>
+                <w:sz w:val="17"/>
+              </w:rPr>
+              <w:t>Run Model B twice on the To-Do List.</w:t>
+            </w:r>
+          </w:p>
+        </w:tc>
+        <w:tc>
+          <w:tcPr>
+            <w:tcW w:type="dxa" w:w="4422"/>
+            <w:vAlign w:val="center"/>
+          </w:tcPr>
+          <w:p>
+            <w:pPr>
+              <w:spacing w:after="0"/>
+            </w:pPr>
+            <w:r/>
+            <w:r>
+              <w:rPr>
+                <w:rFonts w:ascii="Aptos" w:hAnsi="Aptos"/>
+                <w:b w:val="0"/>
+                <w:sz w:val="17"/>
+              </w:rPr>
+              <w:t>The same measurements are recorded under identical limits.</w:t>
+            </w:r>
+          </w:p>
+        </w:tc>
+      </w:tr>
+      <w:tr>
+        <w:tc>
+          <w:tcPr>
+            <w:tcW w:type="dxa" w:w="1247"/>
+            <w:shd w:fill="F2F6F9"/>
+            <w:vAlign w:val="center"/>
+          </w:tcPr>
+          <w:p>
+            <w:pPr>
+              <w:spacing w:after="0"/>
+            </w:pPr>
+            <w:r/>
+            <w:r>
+              <w:rPr>
+                <w:rFonts w:ascii="Aptos" w:hAnsi="Aptos"/>
+                <w:b/>
+                <w:color w:val="17324D"/>
+                <w:sz w:val="17"/>
+              </w:rPr>
+              <w:t>D1-04</w:t>
+            </w:r>
+          </w:p>
+        </w:tc>
+        <w:tc>
+          <w:tcPr>
+            <w:tcW w:type="dxa" w:w="3969"/>
+            <w:shd w:fill="F2F6F9"/>
+            <w:vAlign w:val="center"/>
+          </w:tcPr>
+          <w:p>
+            <w:pPr>
+              <w:spacing w:after="0"/>
+            </w:pPr>
+            <w:r/>
+            <w:r>
+              <w:rPr>
+                <w:rFonts w:ascii="Aptos" w:hAnsi="Aptos"/>
+                <w:b w:val="0"/>
+                <w:sz w:val="17"/>
+              </w:rPr>
+              <w:t>Execute functional, responsive and automated-test checks.</w:t>
+            </w:r>
+          </w:p>
+        </w:tc>
+        <w:tc>
+          <w:tcPr>
+            <w:tcW w:type="dxa" w:w="4422"/>
+            <w:shd w:fill="F2F6F9"/>
+            <w:vAlign w:val="center"/>
+          </w:tcPr>
+          <w:p>
+            <w:pPr>
+              <w:spacing w:after="0"/>
+            </w:pPr>
+            <w:r/>
+            <w:r>
+              <w:rPr>
+                <w:rFonts w:ascii="Aptos" w:hAnsi="Aptos"/>
+                <w:b w:val="0"/>
+                <w:sz w:val="17"/>
+              </w:rPr>
+              <w:t>Every checklist item in Section 3.3 has Pass/Fail plus a short note.</w:t>
+            </w:r>
+          </w:p>
+        </w:tc>
+      </w:tr>
+      <w:tr>
+        <w:tc>
+          <w:tcPr>
+            <w:tcW w:type="dxa" w:w="1247"/>
+            <w:vAlign w:val="center"/>
+          </w:tcPr>
+          <w:p>
+            <w:pPr>
+              <w:spacing w:after="0"/>
+            </w:pPr>
+            <w:r/>
+            <w:r>
+              <w:rPr>
+                <w:rFonts w:ascii="Aptos" w:hAnsi="Aptos"/>
+                <w:b/>
+                <w:color w:val="17324D"/>
+                <w:sz w:val="17"/>
+              </w:rPr>
+              <w:t>D1-05</w:t>
+            </w:r>
+          </w:p>
+        </w:tc>
+        <w:tc>
+          <w:tcPr>
+            <w:tcW w:type="dxa" w:w="3969"/>
+            <w:vAlign w:val="center"/>
+          </w:tcPr>
+          <w:p>
+            <w:pPr>
+              <w:spacing w:after="0"/>
+            </w:pPr>
+            <w:r/>
+            <w:r>
+              <w:rPr>
+                <w:rFonts w:ascii="Aptos" w:hAnsi="Aptos"/>
+                <w:b w:val="0"/>
+                <w:sz w:val="17"/>
+              </w:rPr>
+              <w:t>Complete external fact-sheet fields for Model A.</w:t>
+            </w:r>
+          </w:p>
+        </w:tc>
+        <w:tc>
+          <w:tcPr>
+            <w:tcW w:type="dxa" w:w="4422"/>
+            <w:vAlign w:val="center"/>
+          </w:tcPr>
+          <w:p>
+            <w:pPr>
+              <w:spacing w:after="0"/>
+            </w:pPr>
+            <w:r/>
+            <w:r>
+              <w:rPr>
+                <w:rFonts w:ascii="Aptos" w:hAnsi="Aptos"/>
+                <w:b w:val="0"/>
+                <w:sz w:val="17"/>
+              </w:rPr>
+              <w:t>Every value has a source and capture date.</w:t>
+            </w:r>
+          </w:p>
+        </w:tc>
+      </w:tr>
+      <w:tr>
+        <w:tc>
+          <w:tcPr>
+            <w:tcW w:type="dxa" w:w="1247"/>
+            <w:shd w:fill="F2F6F9"/>
+            <w:vAlign w:val="center"/>
+          </w:tcPr>
+          <w:p>
+            <w:pPr>
+              <w:spacing w:after="0"/>
+            </w:pPr>
+            <w:r/>
+            <w:r>
+              <w:rPr>
+                <w:rFonts w:ascii="Aptos" w:hAnsi="Aptos"/>
+                <w:b/>
+                <w:color w:val="17324D"/>
+                <w:sz w:val="17"/>
+              </w:rPr>
+              <w:t>D1-06</w:t>
+            </w:r>
+          </w:p>
+        </w:tc>
+        <w:tc>
+          <w:tcPr>
+            <w:tcW w:type="dxa" w:w="3969"/>
+            <w:shd w:fill="F2F6F9"/>
+            <w:vAlign w:val="center"/>
+          </w:tcPr>
+          <w:p>
+            <w:pPr>
+              <w:spacing w:after="0"/>
+            </w:pPr>
+            <w:r/>
+            <w:r>
+              <w:rPr>
+                <w:rFonts w:ascii="Aptos" w:hAnsi="Aptos"/>
+                <w:b w:val="0"/>
+                <w:sz w:val="17"/>
+              </w:rPr>
+              <w:t>Cross-review the shooter delivered by Developer 2.</w:t>
+            </w:r>
+          </w:p>
+        </w:tc>
+        <w:tc>
+          <w:tcPr>
+            <w:tcW w:type="dxa" w:w="4422"/>
+            <w:shd w:fill="F2F6F9"/>
+            <w:vAlign w:val="center"/>
+          </w:tcPr>
+          <w:p>
+            <w:pPr>
+              <w:spacing w:after="0"/>
+            </w:pPr>
+            <w:r/>
+            <w:r>
+              <w:rPr>
+                <w:rFonts w:ascii="Aptos" w:hAnsi="Aptos"/>
+                <w:b w:val="0"/>
+                <w:sz w:val="17"/>
+              </w:rPr>
+              <w:t>Human rubric is completed without editing the implementation.</w:t>
+            </w:r>
+          </w:p>
+        </w:tc>
+      </w:tr>
+    </w:tbl>
+    <w:p>
+      <w:pPr>
+        <w:spacing w:after="20"/>
+      </w:pPr>
+    </w:p>
+    <w:p>
+      <w:pPr>
+        <w:pStyle w:val="Heading2"/>
+        <w:keepNext/>
+      </w:pPr>
+      <w:r>
+        <w:t>4.4 Tasks for Developer 2 — Shooter owner</w:t>
+      </w:r>
+    </w:p>
+    <w:tbl>
+      <w:tblPr>
+        <w:tblStyle w:val="TableGrid"/>
+        <w:tblW w:type="auto" w:w="0"/>
+        <w:jc w:val="center"/>
+        <w:tblLayout w:type="fixed"/>
+        <w:tblLook w:firstColumn="1" w:firstRow="1" w:lastColumn="0" w:lastRow="0" w:noHBand="0" w:noVBand="1" w:val="04A0"/>
+      </w:tblPr>
+      <w:tblGrid>
+        <w:gridCol w:w="3400"/>
+        <w:gridCol w:w="3400"/>
+        <w:gridCol w:w="3400"/>
+      </w:tblGrid>
+      <w:tr>
+        <w:tc>
+          <w:tcPr>
+            <w:tcW w:type="dxa" w:w="1247"/>
+            <w:shd w:fill="17324D"/>
+            <w:vAlign w:val="center"/>
+          </w:tcPr>
+          <w:p>
+            <w:pPr>
+              <w:spacing w:after="0"/>
+            </w:pPr>
+            <w:r/>
+            <w:r>
+              <w:rPr>
+                <w:rFonts w:ascii="Aptos" w:hAnsi="Aptos"/>
+                <w:b/>
+                <w:color w:val="FFFFFF"/>
+                <w:sz w:val="18"/>
+              </w:rPr>
+              <w:t>Task ID</w:t>
+            </w:r>
+          </w:p>
+        </w:tc>
+        <w:tc>
+          <w:tcPr>
+            <w:tcW w:type="dxa" w:w="3969"/>
+            <w:shd w:fill="17324D"/>
+            <w:vAlign w:val="center"/>
+          </w:tcPr>
+          <w:p>
+            <w:pPr>
+              <w:spacing w:after="0"/>
+            </w:pPr>
+            <w:r/>
+            <w:r>
+              <w:rPr>
+                <w:rFonts w:ascii="Aptos" w:hAnsi="Aptos"/>
+                <w:b/>
+                <w:color w:val="FFFFFF"/>
+                <w:sz w:val="18"/>
+              </w:rPr>
+              <w:t>Task</w:t>
+            </w:r>
+          </w:p>
+        </w:tc>
+        <w:tc>
+          <w:tcPr>
+            <w:tcW w:type="dxa" w:w="4422"/>
+            <w:shd w:fill="17324D"/>
+            <w:vAlign w:val="center"/>
+          </w:tcPr>
+          <w:p>
+            <w:pPr>
+              <w:spacing w:after="0"/>
+            </w:pPr>
+            <w:r/>
+            <w:r>
+              <w:rPr>
+                <w:rFonts w:ascii="Aptos" w:hAnsi="Aptos"/>
+                <w:b/>
+                <w:color w:val="FFFFFF"/>
+                <w:sz w:val="18"/>
+              </w:rPr>
+              <w:t>Definition of done</w:t>
+            </w:r>
+          </w:p>
+        </w:tc>
+      </w:tr>
+      <w:tr>
+        <w:tc>
+          <w:tcPr>
+            <w:tcW w:type="dxa" w:w="1247"/>
+            <w:vAlign w:val="center"/>
+          </w:tcPr>
+          <w:p>
+            <w:pPr>
+              <w:spacing w:after="0"/>
+            </w:pPr>
+            <w:r/>
+            <w:r>
+              <w:rPr>
+                <w:rFonts w:ascii="Aptos" w:hAnsi="Aptos"/>
+                <w:b/>
+                <w:color w:val="17324D"/>
+                <w:sz w:val="17"/>
+              </w:rPr>
+              <w:t>D2-01</w:t>
+            </w:r>
+          </w:p>
+        </w:tc>
+        <w:tc>
+          <w:tcPr>
+            <w:tcW w:type="dxa" w:w="3969"/>
+            <w:vAlign w:val="center"/>
+          </w:tcPr>
+          <w:p>
+            <w:pPr>
+              <w:spacing w:after="0"/>
+            </w:pPr>
+            <w:r/>
+            <w:r>
+              <w:rPr>
+                <w:rFonts w:ascii="Aptos" w:hAnsi="Aptos"/>
+                <w:b w:val="0"/>
+                <w:sz w:val="17"/>
+              </w:rPr>
+              <w:t>Prepare identical shooter starting repositories and verify the frozen prompt.</w:t>
+            </w:r>
+          </w:p>
+        </w:tc>
+        <w:tc>
+          <w:tcPr>
+            <w:tcW w:type="dxa" w:w="4422"/>
+            <w:vAlign w:val="center"/>
+          </w:tcPr>
+          <w:p>
+            <w:pPr>
+              <w:spacing w:after="0"/>
+            </w:pPr>
+            <w:r/>
+            <w:r>
+              <w:rPr>
+                <w:rFonts w:ascii="Aptos" w:hAnsi="Aptos"/>
+                <w:b w:val="0"/>
+                <w:sz w:val="17"/>
+              </w:rPr>
+              <w:t>Both copies start from the same commit and environment.</w:t>
+            </w:r>
+          </w:p>
+        </w:tc>
+      </w:tr>
+      <w:tr>
+        <w:tc>
+          <w:tcPr>
+            <w:tcW w:type="dxa" w:w="1247"/>
+            <w:shd w:fill="F2F6F9"/>
+            <w:vAlign w:val="center"/>
+          </w:tcPr>
+          <w:p>
+            <w:pPr>
+              <w:spacing w:after="0"/>
+            </w:pPr>
+            <w:r/>
+            <w:r>
+              <w:rPr>
+                <w:rFonts w:ascii="Aptos" w:hAnsi="Aptos"/>
+                <w:b/>
+                <w:color w:val="17324D"/>
+                <w:sz w:val="17"/>
+              </w:rPr>
+              <w:t>D2-02</w:t>
+            </w:r>
+          </w:p>
+        </w:tc>
+        <w:tc>
+          <w:tcPr>
+            <w:tcW w:type="dxa" w:w="3969"/>
+            <w:shd w:fill="F2F6F9"/>
+            <w:vAlign w:val="center"/>
+          </w:tcPr>
+          <w:p>
+            <w:pPr>
+              <w:spacing w:after="0"/>
+            </w:pPr>
+            <w:r/>
+            <w:r>
+              <w:rPr>
+                <w:rFonts w:ascii="Aptos" w:hAnsi="Aptos"/>
+                <w:b w:val="0"/>
+                <w:sz w:val="17"/>
+              </w:rPr>
+              <w:t>Run Model A twice on the shooter.</w:t>
+            </w:r>
+          </w:p>
+        </w:tc>
+        <w:tc>
+          <w:tcPr>
+            <w:tcW w:type="dxa" w:w="4422"/>
+            <w:shd w:fill="F2F6F9"/>
+            <w:vAlign w:val="center"/>
+          </w:tcPr>
+          <w:p>
+            <w:pPr>
+              <w:spacing w:after="0"/>
+            </w:pPr>
+            <w:r/>
+            <w:r>
+              <w:rPr>
+                <w:rFonts w:ascii="Aptos" w:hAnsi="Aptos"/>
+                <w:b w:val="0"/>
+                <w:sz w:val="17"/>
+              </w:rPr>
+              <w:t>Both outputs, times, costs and correction counts are recorded.</w:t>
+            </w:r>
+          </w:p>
+        </w:tc>
+      </w:tr>
+      <w:tr>
+        <w:tc>
+          <w:tcPr>
+            <w:tcW w:type="dxa" w:w="1247"/>
+            <w:vAlign w:val="center"/>
+          </w:tcPr>
+          <w:p>
+            <w:pPr>
+              <w:spacing w:after="0"/>
+            </w:pPr>
+            <w:r/>
+            <w:r>
+              <w:rPr>
+                <w:rFonts w:ascii="Aptos" w:hAnsi="Aptos"/>
+                <w:b/>
+                <w:color w:val="17324D"/>
+                <w:sz w:val="17"/>
+              </w:rPr>
+              <w:t>D2-03</w:t>
+            </w:r>
+          </w:p>
+        </w:tc>
+        <w:tc>
+          <w:tcPr>
+            <w:tcW w:type="dxa" w:w="3969"/>
+            <w:vAlign w:val="center"/>
+          </w:tcPr>
+          <w:p>
+            <w:pPr>
+              <w:spacing w:after="0"/>
+            </w:pPr>
+            <w:r/>
+            <w:r>
+              <w:rPr>
+                <w:rFonts w:ascii="Aptos" w:hAnsi="Aptos"/>
+                <w:b w:val="0"/>
+                <w:sz w:val="17"/>
+              </w:rPr>
+              <w:t>Run Model B twice on the shooter.</w:t>
+            </w:r>
+          </w:p>
+        </w:tc>
+        <w:tc>
+          <w:tcPr>
+            <w:tcW w:type="dxa" w:w="4422"/>
+            <w:vAlign w:val="center"/>
+          </w:tcPr>
+          <w:p>
+            <w:pPr>
+              <w:spacing w:after="0"/>
+            </w:pPr>
+            <w:r/>
+            <w:r>
+              <w:rPr>
+                <w:rFonts w:ascii="Aptos" w:hAnsi="Aptos"/>
+                <w:b w:val="0"/>
+                <w:sz w:val="17"/>
+              </w:rPr>
+              <w:t>The same measurements are recorded under identical limits.</w:t>
+            </w:r>
+          </w:p>
+        </w:tc>
+      </w:tr>
+      <w:tr>
+        <w:tc>
+          <w:tcPr>
+            <w:tcW w:type="dxa" w:w="1247"/>
+            <w:shd w:fill="F2F6F9"/>
+            <w:vAlign w:val="center"/>
+          </w:tcPr>
+          <w:p>
+            <w:pPr>
+              <w:spacing w:after="0"/>
+            </w:pPr>
+            <w:r/>
+            <w:r>
+              <w:rPr>
+                <w:rFonts w:ascii="Aptos" w:hAnsi="Aptos"/>
+                <w:b/>
+                <w:color w:val="17324D"/>
+                <w:sz w:val="17"/>
+              </w:rPr>
+              <w:t>D2-04</w:t>
+            </w:r>
+          </w:p>
+        </w:tc>
+        <w:tc>
+          <w:tcPr>
+            <w:tcW w:type="dxa" w:w="3969"/>
+            <w:shd w:fill="F2F6F9"/>
+            <w:vAlign w:val="center"/>
+          </w:tcPr>
+          <w:p>
+            <w:pPr>
+              <w:spacing w:after="0"/>
+            </w:pPr>
+            <w:r/>
+            <w:r>
+              <w:rPr>
+                <w:rFonts w:ascii="Aptos" w:hAnsi="Aptos"/>
+                <w:b w:val="0"/>
+                <w:sz w:val="17"/>
+              </w:rPr>
+              <w:t>Execute gameplay, boss-flow, responsive and automated-test checks.</w:t>
+            </w:r>
+          </w:p>
+        </w:tc>
+        <w:tc>
+          <w:tcPr>
+            <w:tcW w:type="dxa" w:w="4422"/>
+            <w:shd w:fill="F2F6F9"/>
+            <w:vAlign w:val="center"/>
+          </w:tcPr>
+          <w:p>
+            <w:pPr>
+              <w:spacing w:after="0"/>
+            </w:pPr>
+            <w:r/>
+            <w:r>
+              <w:rPr>
+                <w:rFonts w:ascii="Aptos" w:hAnsi="Aptos"/>
+                <w:b w:val="0"/>
+                <w:sz w:val="17"/>
+              </w:rPr>
+              <w:t>Every checklist item in Section 3.4 has Pass/Fail plus a short note.</w:t>
+            </w:r>
+          </w:p>
+        </w:tc>
+      </w:tr>
+      <w:tr>
+        <w:tc>
+          <w:tcPr>
+            <w:tcW w:type="dxa" w:w="1247"/>
+            <w:vAlign w:val="center"/>
+          </w:tcPr>
+          <w:p>
+            <w:pPr>
+              <w:spacing w:after="0"/>
+            </w:pPr>
+            <w:r/>
+            <w:r>
+              <w:rPr>
+                <w:rFonts w:ascii="Aptos" w:hAnsi="Aptos"/>
+                <w:b/>
+                <w:color w:val="17324D"/>
+                <w:sz w:val="17"/>
+              </w:rPr>
+              <w:t>D2-05</w:t>
+            </w:r>
+          </w:p>
+        </w:tc>
+        <w:tc>
+          <w:tcPr>
+            <w:tcW w:type="dxa" w:w="3969"/>
+            <w:vAlign w:val="center"/>
+          </w:tcPr>
+          <w:p>
+            <w:pPr>
+              <w:spacing w:after="0"/>
+            </w:pPr>
+            <w:r/>
+            <w:r>
+              <w:rPr>
+                <w:rFonts w:ascii="Aptos" w:hAnsi="Aptos"/>
+                <w:b w:val="0"/>
+                <w:sz w:val="17"/>
+              </w:rPr>
+              <w:t>Complete external fact-sheet fields for Model B.</w:t>
+            </w:r>
+          </w:p>
+        </w:tc>
+        <w:tc>
+          <w:tcPr>
+            <w:tcW w:type="dxa" w:w="4422"/>
+            <w:vAlign w:val="center"/>
+          </w:tcPr>
+          <w:p>
+            <w:pPr>
+              <w:spacing w:after="0"/>
+            </w:pPr>
+            <w:r/>
+            <w:r>
+              <w:rPr>
+                <w:rFonts w:ascii="Aptos" w:hAnsi="Aptos"/>
+                <w:b w:val="0"/>
+                <w:sz w:val="17"/>
+              </w:rPr>
+              <w:t>Every value has a source and capture date.</w:t>
+            </w:r>
+          </w:p>
+        </w:tc>
+      </w:tr>
+      <w:tr>
+        <w:tc>
+          <w:tcPr>
+            <w:tcW w:type="dxa" w:w="1247"/>
+            <w:shd w:fill="F2F6F9"/>
+            <w:vAlign w:val="center"/>
+          </w:tcPr>
+          <w:p>
+            <w:pPr>
+              <w:spacing w:after="0"/>
+            </w:pPr>
+            <w:r/>
+            <w:r>
+              <w:rPr>
+                <w:rFonts w:ascii="Aptos" w:hAnsi="Aptos"/>
+                <w:b/>
+                <w:color w:val="17324D"/>
+                <w:sz w:val="17"/>
+              </w:rPr>
+              <w:t>D2-06</w:t>
+            </w:r>
+          </w:p>
+        </w:tc>
+        <w:tc>
+          <w:tcPr>
+            <w:tcW w:type="dxa" w:w="3969"/>
+            <w:shd w:fill="F2F6F9"/>
+            <w:vAlign w:val="center"/>
+          </w:tcPr>
+          <w:p>
+            <w:pPr>
+              <w:spacing w:after="0"/>
+            </w:pPr>
+            <w:r/>
+            <w:r>
+              <w:rPr>
+                <w:rFonts w:ascii="Aptos" w:hAnsi="Aptos"/>
+                <w:b w:val="0"/>
+                <w:sz w:val="17"/>
+              </w:rPr>
+              <w:t>Cross-review the To-Do List delivered by Developer 1.</w:t>
+            </w:r>
+          </w:p>
+        </w:tc>
+        <w:tc>
+          <w:tcPr>
+            <w:tcW w:type="dxa" w:w="4422"/>
+            <w:shd w:fill="F2F6F9"/>
+            <w:vAlign w:val="center"/>
+          </w:tcPr>
+          <w:p>
+            <w:pPr>
+              <w:spacing w:after="0"/>
+            </w:pPr>
+            <w:r/>
+            <w:r>
+              <w:rPr>
+                <w:rFonts w:ascii="Aptos" w:hAnsi="Aptos"/>
+                <w:b w:val="0"/>
+                <w:sz w:val="17"/>
+              </w:rPr>
+              <w:t>Human rubric is completed without editing the implementation.</w:t>
+            </w:r>
+          </w:p>
+        </w:tc>
+      </w:tr>
+    </w:tbl>
+    <w:p>
+      <w:pPr>
+        <w:spacing w:after="20"/>
+      </w:pPr>
+    </w:p>
+    <w:p>
+      <w:pPr>
+        <w:pStyle w:val="Heading2"/>
+        <w:keepNext/>
+      </w:pPr>
+      <w:r>
+        <w:t>4.5 Five-day sprint schedule</w:t>
+      </w:r>
+    </w:p>
+    <w:tbl>
+      <w:tblPr>
+        <w:tblStyle w:val="TableGrid"/>
+        <w:tblW w:type="auto" w:w="0"/>
+        <w:jc w:val="center"/>
+        <w:tblLayout w:type="fixed"/>
+        <w:tblLook w:firstColumn="1" w:firstRow="1" w:lastColumn="0" w:lastRow="0" w:noHBand="0" w:noVBand="1" w:val="04A0"/>
+      </w:tblPr>
+      <w:tblGrid>
+        <w:gridCol w:w="2550"/>
+        <w:gridCol w:w="2550"/>
+        <w:gridCol w:w="2550"/>
+        <w:gridCol w:w="2550"/>
+      </w:tblGrid>
+      <w:tr>
+        <w:tc>
+          <w:tcPr>
+            <w:tcW w:type="dxa" w:w="1701"/>
+            <w:shd w:fill="17324D"/>
+            <w:vAlign w:val="center"/>
+          </w:tcPr>
+          <w:p>
+            <w:pPr>
+              <w:spacing w:after="0"/>
+            </w:pPr>
+            <w:r/>
+            <w:r>
+              <w:rPr>
+                <w:rFonts w:ascii="Aptos" w:hAnsi="Aptos"/>
+                <w:b/>
+                <w:color w:val="FFFFFF"/>
+                <w:sz w:val="18"/>
+              </w:rPr>
+              <w:t>Day</w:t>
+            </w:r>
+          </w:p>
+        </w:tc>
+        <w:tc>
+          <w:tcPr>
+            <w:tcW w:type="dxa" w:w="2721"/>
+            <w:shd w:fill="17324D"/>
+            <w:vAlign w:val="center"/>
+          </w:tcPr>
+          <w:p>
+            <w:pPr>
+              <w:spacing w:after="0"/>
+            </w:pPr>
+            <w:r/>
+            <w:r>
+              <w:rPr>
+                <w:rFonts w:ascii="Aptos" w:hAnsi="Aptos"/>
+                <w:b/>
+                <w:color w:val="FFFFFF"/>
+                <w:sz w:val="18"/>
+              </w:rPr>
+              <w:t>Developer 1</w:t>
+            </w:r>
+          </w:p>
+        </w:tc>
+        <w:tc>
+          <w:tcPr>
+            <w:tcW w:type="dxa" w:w="2721"/>
+            <w:shd w:fill="17324D"/>
+            <w:vAlign w:val="center"/>
+          </w:tcPr>
+          <w:p>
+            <w:pPr>
+              <w:spacing w:after="0"/>
+            </w:pPr>
+            <w:r/>
+            <w:r>
+              <w:rPr>
+                <w:rFonts w:ascii="Aptos" w:hAnsi="Aptos"/>
+                <w:b/>
+                <w:color w:val="FFFFFF"/>
+                <w:sz w:val="18"/>
+              </w:rPr>
+              <w:t>Developer 2</w:t>
+            </w:r>
+          </w:p>
+        </w:tc>
+        <w:tc>
+          <w:tcPr>
+            <w:tcW w:type="dxa" w:w="2494"/>
+            <w:shd w:fill="17324D"/>
+            <w:vAlign w:val="center"/>
+          </w:tcPr>
+          <w:p>
+            <w:pPr>
+              <w:spacing w:after="0"/>
+            </w:pPr>
+            <w:r/>
+            <w:r>
+              <w:rPr>
+                <w:rFonts w:ascii="Aptos" w:hAnsi="Aptos"/>
+                <w:b/>
+                <w:color w:val="FFFFFF"/>
+                <w:sz w:val="18"/>
+              </w:rPr>
+              <w:t>Shared outcome</w:t>
+            </w:r>
+          </w:p>
+        </w:tc>
+      </w:tr>
+      <w:tr>
+        <w:tc>
+          <w:tcPr>
+            <w:tcW w:type="dxa" w:w="1701"/>
+            <w:vAlign w:val="center"/>
+          </w:tcPr>
+          <w:p>
+            <w:pPr>
+              <w:spacing w:after="0"/>
+            </w:pPr>
+            <w:r/>
+            <w:r>
+              <w:rPr>
+                <w:rFonts w:ascii="Aptos" w:hAnsi="Aptos"/>
+                <w:b/>
+                <w:color w:val="17324D"/>
+                <w:sz w:val="17"/>
+              </w:rPr>
+              <w:t>Day 1 — Plan</w:t>
+            </w:r>
+          </w:p>
+        </w:tc>
+        <w:tc>
+          <w:tcPr>
+            <w:tcW w:type="dxa" w:w="2721"/>
+            <w:vAlign w:val="center"/>
+          </w:tcPr>
+          <w:p>
+            <w:pPr>
+              <w:spacing w:after="0"/>
+            </w:pPr>
+            <w:r/>
+            <w:r>
+              <w:rPr>
+                <w:rFonts w:ascii="Aptos" w:hAnsi="Aptos"/>
+                <w:b w:val="0"/>
+                <w:sz w:val="17"/>
+              </w:rPr>
+              <w:t>Prepare To-Do baseline and Model A facts.</w:t>
+            </w:r>
+          </w:p>
+        </w:tc>
+        <w:tc>
+          <w:tcPr>
+            <w:tcW w:type="dxa" w:w="2721"/>
+            <w:vAlign w:val="center"/>
+          </w:tcPr>
+          <w:p>
+            <w:pPr>
+              <w:spacing w:after="0"/>
+            </w:pPr>
+            <w:r/>
+            <w:r>
+              <w:rPr>
+                <w:rFonts w:ascii="Aptos" w:hAnsi="Aptos"/>
+                <w:b w:val="0"/>
+                <w:sz w:val="17"/>
+              </w:rPr>
+              <w:t>Prepare shooter baseline and Model B facts.</w:t>
+            </w:r>
+          </w:p>
+        </w:tc>
+        <w:tc>
+          <w:tcPr>
+            <w:tcW w:type="dxa" w:w="2494"/>
+            <w:vAlign w:val="center"/>
+          </w:tcPr>
+          <w:p>
+            <w:pPr>
+              <w:spacing w:after="0"/>
+            </w:pPr>
+            <w:r/>
+            <w:r>
+              <w:rPr>
+                <w:rFonts w:ascii="Aptos" w:hAnsi="Aptos"/>
+                <w:b w:val="0"/>
+                <w:sz w:val="17"/>
+              </w:rPr>
+              <w:t>Prompts, models, environment and acceptance criteria frozen.</w:t>
+            </w:r>
+          </w:p>
+        </w:tc>
+      </w:tr>
+      <w:tr>
+        <w:tc>
+          <w:tcPr>
+            <w:tcW w:type="dxa" w:w="1701"/>
+            <w:shd w:fill="F2F6F9"/>
+            <w:vAlign w:val="center"/>
+          </w:tcPr>
+          <w:p>
+            <w:pPr>
+              <w:spacing w:after="0"/>
+            </w:pPr>
+            <w:r/>
+            <w:r>
+              <w:rPr>
+                <w:rFonts w:ascii="Aptos" w:hAnsi="Aptos"/>
+                <w:b/>
+                <w:color w:val="17324D"/>
+                <w:sz w:val="17"/>
+              </w:rPr>
+              <w:t>Day 2 — Model A</w:t>
+            </w:r>
+          </w:p>
+        </w:tc>
+        <w:tc>
+          <w:tcPr>
+            <w:tcW w:type="dxa" w:w="2721"/>
+            <w:shd w:fill="F2F6F9"/>
+            <w:vAlign w:val="center"/>
+          </w:tcPr>
+          <w:p>
+            <w:pPr>
+              <w:spacing w:after="0"/>
+            </w:pPr>
+            <w:r/>
+            <w:r>
+              <w:rPr>
+                <w:rFonts w:ascii="Aptos" w:hAnsi="Aptos"/>
+                <w:b w:val="0"/>
+                <w:sz w:val="17"/>
+              </w:rPr>
+              <w:t>Run Model A To-Do tests.</w:t>
+            </w:r>
+          </w:p>
+        </w:tc>
+        <w:tc>
+          <w:tcPr>
+            <w:tcW w:type="dxa" w:w="2721"/>
+            <w:shd w:fill="F2F6F9"/>
+            <w:vAlign w:val="center"/>
+          </w:tcPr>
+          <w:p>
+            <w:pPr>
+              <w:spacing w:after="0"/>
+            </w:pPr>
+            <w:r/>
+            <w:r>
+              <w:rPr>
+                <w:rFonts w:ascii="Aptos" w:hAnsi="Aptos"/>
+                <w:b w:val="0"/>
+                <w:sz w:val="17"/>
+              </w:rPr>
+              <w:t>Run Model A shooter tests.</w:t>
+            </w:r>
+          </w:p>
+        </w:tc>
+        <w:tc>
+          <w:tcPr>
+            <w:tcW w:type="dxa" w:w="2494"/>
+            <w:shd w:fill="F2F6F9"/>
+            <w:vAlign w:val="center"/>
+          </w:tcPr>
+          <w:p>
+            <w:pPr>
+              <w:spacing w:after="0"/>
+            </w:pPr>
+            <w:r/>
+            <w:r>
+              <w:rPr>
+                <w:rFonts w:ascii="Aptos" w:hAnsi="Aptos"/>
+                <w:b w:val="0"/>
+                <w:sz w:val="17"/>
+              </w:rPr>
+              <w:t>First two Model A runs per app completed.</w:t>
+            </w:r>
+          </w:p>
+        </w:tc>
+      </w:tr>
+      <w:tr>
+        <w:tc>
+          <w:tcPr>
+            <w:tcW w:type="dxa" w:w="1701"/>
+            <w:vAlign w:val="center"/>
+          </w:tcPr>
+          <w:p>
+            <w:pPr>
+              <w:spacing w:after="0"/>
+            </w:pPr>
+            <w:r/>
+            <w:r>
+              <w:rPr>
+                <w:rFonts w:ascii="Aptos" w:hAnsi="Aptos"/>
+                <w:b/>
+                <w:color w:val="17324D"/>
+                <w:sz w:val="17"/>
+              </w:rPr>
+              <w:t>Day 3 — Model B</w:t>
+            </w:r>
+          </w:p>
+        </w:tc>
+        <w:tc>
+          <w:tcPr>
+            <w:tcW w:type="dxa" w:w="2721"/>
+            <w:vAlign w:val="center"/>
+          </w:tcPr>
+          <w:p>
+            <w:pPr>
+              <w:spacing w:after="0"/>
+            </w:pPr>
+            <w:r/>
+            <w:r>
+              <w:rPr>
+                <w:rFonts w:ascii="Aptos" w:hAnsi="Aptos"/>
+                <w:b w:val="0"/>
+                <w:sz w:val="17"/>
+              </w:rPr>
+              <w:t>Run Model B To-Do tests.</w:t>
+            </w:r>
+          </w:p>
+        </w:tc>
+        <w:tc>
+          <w:tcPr>
+            <w:tcW w:type="dxa" w:w="2721"/>
+            <w:vAlign w:val="center"/>
+          </w:tcPr>
+          <w:p>
+            <w:pPr>
+              <w:spacing w:after="0"/>
+            </w:pPr>
+            <w:r/>
+            <w:r>
+              <w:rPr>
+                <w:rFonts w:ascii="Aptos" w:hAnsi="Aptos"/>
+                <w:b w:val="0"/>
+                <w:sz w:val="17"/>
+              </w:rPr>
+              <w:t>Run Model B shooter tests.</w:t>
+            </w:r>
+          </w:p>
+        </w:tc>
+        <w:tc>
+          <w:tcPr>
+            <w:tcW w:type="dxa" w:w="2494"/>
+            <w:vAlign w:val="center"/>
+          </w:tcPr>
+          <w:p>
+            <w:pPr>
+              <w:spacing w:after="0"/>
+            </w:pPr>
+            <w:r/>
+            <w:r>
+              <w:rPr>
+                <w:rFonts w:ascii="Aptos" w:hAnsi="Aptos"/>
+                <w:b w:val="0"/>
+                <w:sz w:val="17"/>
+              </w:rPr>
+              <w:t>First two Model B runs per app completed.</w:t>
+            </w:r>
+          </w:p>
+        </w:tc>
+      </w:tr>
+      <w:tr>
+        <w:tc>
+          <w:tcPr>
+            <w:tcW w:type="dxa" w:w="1701"/>
+            <w:shd w:fill="F2F6F9"/>
+            <w:vAlign w:val="center"/>
+          </w:tcPr>
+          <w:p>
+            <w:pPr>
+              <w:spacing w:after="0"/>
+            </w:pPr>
+            <w:r/>
+            <w:r>
+              <w:rPr>
+                <w:rFonts w:ascii="Aptos" w:hAnsi="Aptos"/>
+                <w:b/>
+                <w:color w:val="17324D"/>
+                <w:sz w:val="17"/>
+              </w:rPr>
+              <w:t>Day 4 — Verify</w:t>
+            </w:r>
+          </w:p>
+        </w:tc>
+        <w:tc>
+          <w:tcPr>
+            <w:tcW w:type="dxa" w:w="2721"/>
+            <w:shd w:fill="F2F6F9"/>
+            <w:vAlign w:val="center"/>
+          </w:tcPr>
+          <w:p>
+            <w:pPr>
+              <w:spacing w:after="0"/>
+            </w:pPr>
+            <w:r/>
+            <w:r>
+              <w:rPr>
+                <w:rFonts w:ascii="Aptos" w:hAnsi="Aptos"/>
+                <w:b w:val="0"/>
+                <w:sz w:val="17"/>
+              </w:rPr>
+              <w:t>Finish To-Do checks; review shooter.</w:t>
+            </w:r>
+          </w:p>
+        </w:tc>
+        <w:tc>
+          <w:tcPr>
+            <w:tcW w:type="dxa" w:w="2721"/>
+            <w:shd w:fill="F2F6F9"/>
+            <w:vAlign w:val="center"/>
+          </w:tcPr>
+          <w:p>
+            <w:pPr>
+              <w:spacing w:after="0"/>
+            </w:pPr>
+            <w:r/>
+            <w:r>
+              <w:rPr>
+                <w:rFonts w:ascii="Aptos" w:hAnsi="Aptos"/>
+                <w:b w:val="0"/>
+                <w:sz w:val="17"/>
+              </w:rPr>
+              <w:t>Finish shooter checks; review To-Do.</w:t>
+            </w:r>
+          </w:p>
+        </w:tc>
+        <w:tc>
+          <w:tcPr>
+            <w:tcW w:type="dxa" w:w="2494"/>
+            <w:shd w:fill="F2F6F9"/>
+            <w:vAlign w:val="center"/>
+          </w:tcPr>
+          <w:p>
+            <w:pPr>
+              <w:spacing w:after="0"/>
+            </w:pPr>
+            <w:r/>
+            <w:r>
+              <w:rPr>
+                <w:rFonts w:ascii="Aptos" w:hAnsi="Aptos"/>
+                <w:b w:val="0"/>
+                <w:sz w:val="17"/>
+              </w:rPr>
+              <w:t>Objective results and human scores complete.</w:t>
+            </w:r>
+          </w:p>
+        </w:tc>
+      </w:tr>
+      <w:tr>
+        <w:tc>
+          <w:tcPr>
+            <w:tcW w:type="dxa" w:w="1701"/>
+            <w:vAlign w:val="center"/>
+          </w:tcPr>
+          <w:p>
+            <w:pPr>
+              <w:spacing w:after="0"/>
+            </w:pPr>
+            <w:r/>
+            <w:r>
+              <w:rPr>
+                <w:rFonts w:ascii="Aptos" w:hAnsi="Aptos"/>
+                <w:b/>
+                <w:color w:val="17324D"/>
+                <w:sz w:val="17"/>
+              </w:rPr>
+              <w:t>Day 5 — Decide</w:t>
+            </w:r>
+          </w:p>
+        </w:tc>
+        <w:tc>
+          <w:tcPr>
+            <w:tcW w:type="dxa" w:w="2721"/>
+            <w:vAlign w:val="center"/>
+          </w:tcPr>
+          <w:p>
+            <w:pPr>
+              <w:spacing w:after="0"/>
+            </w:pPr>
+            <w:r/>
+            <w:r>
+              <w:rPr>
+                <w:rFonts w:ascii="Aptos" w:hAnsi="Aptos"/>
+                <w:b w:val="0"/>
+                <w:sz w:val="17"/>
+              </w:rPr>
+              <w:t>Check calculations and limitations.</w:t>
+            </w:r>
+          </w:p>
+        </w:tc>
+        <w:tc>
+          <w:tcPr>
+            <w:tcW w:type="dxa" w:w="2721"/>
+            <w:vAlign w:val="center"/>
+          </w:tcPr>
+          <w:p>
+            <w:pPr>
+              <w:spacing w:after="0"/>
+            </w:pPr>
+            <w:r/>
+            <w:r>
+              <w:rPr>
+                <w:rFonts w:ascii="Aptos" w:hAnsi="Aptos"/>
+                <w:b w:val="0"/>
+                <w:sz w:val="17"/>
+              </w:rPr>
+              <w:t>Check references and recommendation.</w:t>
+            </w:r>
+          </w:p>
+        </w:tc>
+        <w:tc>
+          <w:tcPr>
+            <w:tcW w:type="dxa" w:w="2494"/>
+            <w:vAlign w:val="center"/>
+          </w:tcPr>
+          <w:p>
+            <w:pPr>
+              <w:spacing w:after="0"/>
+            </w:pPr>
+            <w:r/>
+            <w:r>
+              <w:rPr>
+                <w:rFonts w:ascii="Aptos" w:hAnsi="Aptos"/>
+                <w:b w:val="0"/>
+                <w:sz w:val="17"/>
+              </w:rPr>
+              <w:t>Sprint review, conclusion and retrospective completed.</w:t>
+            </w:r>
+          </w:p>
+        </w:tc>
+      </w:tr>
+    </w:tbl>
+    <w:p>
+      <w:pPr>
+        <w:spacing w:after="20"/>
+      </w:pPr>
+    </w:p>
+    <w:p>
+      <w:pPr>
+        <w:pStyle w:val="Heading2"/>
+        <w:keepNext/>
+      </w:pPr>
+      <w:r>
+        <w:t>4.6 Definition of Done</w:t>
+      </w:r>
+    </w:p>
+    <w:p>
+      <w:pPr>
+        <w:pStyle w:val="ListBullet"/>
+        <w:spacing w:after="60"/>
+      </w:pPr>
+      <w:r>
+        <w:t>Both exact model IDs and external fact sheets are complete.</w:t>
+      </w:r>
+    </w:p>
+    <w:p>
+      <w:pPr>
+        <w:pStyle w:val="ListBullet"/>
+        <w:spacing w:after="60"/>
+      </w:pPr>
+      <w:r>
+        <w:t>Both models have two runs for each application under the same limits.</w:t>
+      </w:r>
+    </w:p>
+    <w:p>
+      <w:pPr>
+        <w:pStyle w:val="ListBullet"/>
+        <w:spacing w:after="60"/>
+      </w:pPr>
+      <w:r>
+        <w:t>All To-Do List and shooter checklist rows contain Pass/Fail and a concise note.</w:t>
+      </w:r>
+    </w:p>
+    <w:p>
+      <w:pPr>
+        <w:pStyle w:val="ListBullet"/>
+        <w:spacing w:after="60"/>
+      </w:pPr>
+      <w:r>
+        <w:t>Completion time, measured cost, correction prompts and failed runs are recorded.</w:t>
+      </w:r>
+    </w:p>
+    <w:p>
+      <w:pPr>
+        <w:pStyle w:val="ListBullet"/>
+        <w:spacing w:after="60"/>
+      </w:pPr>
+      <w:r>
+        <w:t>Each developer has cross-reviewed the other application using the human rubric.</w:t>
+      </w:r>
+    </w:p>
+    <w:p>
+      <w:pPr>
+        <w:pStyle w:val="ListBullet"/>
+        <w:spacing w:after="60"/>
+      </w:pPr>
+      <w:r>
+        <w:t>Final layer scores total correctly and the recommendation names its limitations.</w:t>
+      </w:r>
+    </w:p>
+    <w:p>
+      <w:r>
+        <w:br w:type="page"/>
+      </w:r>
+    </w:p>
+    <w:p>
+      <w:pPr>
+        <w:pStyle w:val="Heading1"/>
+        <w:keepNext/>
+      </w:pPr>
+      <w:r>
+        <w:t>5. Evaluation Results</w:t>
+      </w:r>
+    </w:p>
+    <w:p>
+      <w:pPr>
+        <w:pStyle w:val="Heading2"/>
+        <w:keepNext/>
+      </w:pPr>
+      <w:r>
+        <w:t>5.1 Layer 1 — External evidence score</w:t>
       </w:r>
     </w:p>
     <w:p>
@@ -5592,7 +8001,7 @@
         <w:keepNext/>
       </w:pPr>
       <w:r>
-        <w:t>4.2 Layer 2 — Controlled app-test score</w:t>
+        <w:t>5.2 Layer 2 — Controlled app-test score</w:t>
       </w:r>
     </w:p>
     <w:tbl>
@@ -6304,7 +8713,7 @@
         <w:keepNext/>
       </w:pPr>
       <w:r>
-        <w:t>4.3 Measured efficiency</w:t>
+        <w:t>5.3 Measured efficiency</w:t>
       </w:r>
     </w:p>
     <w:tbl>
@@ -6846,7 +9255,7 @@
         <w:keepNext/>
       </w:pPr>
       <w:r>
-        <w:t>4.4 Layer 3 — Human evaluation</w:t>
+        <w:t>5.4 Layer 3 — Human evaluation</w:t>
       </w:r>
     </w:p>
     <w:p>
@@ -7699,7 +10108,7 @@
         <w:keepNext/>
       </w:pPr>
       <w:r>
-        <w:t>4.5 Final comparison</w:t>
+        <w:t>5.5 Final comparison</w:t>
       </w:r>
     </w:p>
     <w:tbl>
@@ -8286,7 +10695,7 @@
         <w:keepNext/>
       </w:pPr>
       <w:r>
-        <w:t>5. Conclusion and Recommendations</w:t>
+        <w:t>6. Conclusion and Recommendations</w:t>
       </w:r>
     </w:p>
     <w:p>
@@ -8295,7 +10704,7 @@
         <w:keepNext/>
       </w:pPr>
       <w:r>
-        <w:t>5.1 Conclusion</w:t>
+        <w:t>6.1 Conclusion</w:t>
       </w:r>
     </w:p>
     <w:tbl>
@@ -8675,7 +11084,7 @@
         <w:keepNext/>
       </w:pPr>
       <w:r>
-        <w:t>5.2 Recommendation</w:t>
+        <w:t>6.2 Recommendation</w:t>
       </w:r>
     </w:p>
     <w:p>
@@ -8716,7 +11125,7 @@
         <w:keepNext/>
       </w:pPr>
       <w:r>
-        <w:t>5.3 Next step</w:t>
+        <w:t>6.3 Next step</w:t>
       </w:r>
     </w:p>
     <w:p>
@@ -8752,7 +11161,7 @@
         <w:keepNext/>
       </w:pPr>
       <w:r>
-        <w:t>6. References</w:t>
+        <w:t>7. References</w:t>
       </w:r>
     </w:p>
     <w:p>
@@ -8793,6 +11202,14 @@
       </w:pPr>
       <w:r>
         <w:t>[5] Tran et al., Vibe Code Bench: Evaluating AI Models on End-to-End Web Application Development. https://arxiv.org/abs/2603.04601</w:t>
+      </w:r>
+    </w:p>
+    <w:p>
+      <w:pPr>
+        <w:spacing w:after="100"/>
+      </w:pPr>
+      <w:r>
+        <w:t>[6] Atlassian, What is Scrum? Guide to the Agile Framework. https://www.atlassian.com/agile/scrum</w:t>
       </w:r>
     </w:p>
     <w:sectPr>

</xml_diff>